<commit_message>
Complete HRDotNet performance workflows and requirements
</commit_message>
<xml_diff>
--- a/outputs/HRDotNet-Performance-Product-Requirements.docx
+++ b/outputs/HRDotNet-Performance-Product-Requirements.docx
@@ -61,7 +61,7 @@
     </w:p>
     <w:p>
       <w:r>
-        <w:t>HRDotNet Performance connects employee goals, sequential assessments, and documented performance outcomes in one workspace. This specification defines the current intended MVP, including position-specific Goals Templates, reusable Behavioral Templates, actual employee goal assignments, manager verification, and consolidated evaluation results. HR must confirm the policy decisions in Section 15 before production rollout.</w:t>
+        <w:t>HRDotNet Performance connects employee goals, sequential assessments, and documented performance outcomes in one workspace. This specification defines the current intended MVP, including position-specific KPI Goal Templates, reusable Behavioral Assessment Templates, actual employee goal assignments, manager verification, and consolidated evaluation results. HR must confirm the policy decisions in Section 15 before production rollout.</w:t>
       </w:r>
     </w:p>
     <w:p>
@@ -95,7 +95,7 @@
     </w:p>
     <w:p>
       <w:r>
-        <w:t>The MVP covers Dashboard, Goals, Reviews, Goals Templates, Behavioral Templates, Review Cycles, 202 Files, Reports, and the HRDotNet employee directory. It includes standard and 360-degree feedback, draft preservation, sequential stages, release controls, search, filtering, and numbered pagination. One application shell and design system serve all three roles.</w:t>
+        <w:t>The MVP covers Dashboard, Goals, Reviews, KPI Goal Templates, Behavioral Assessment Templates, Review Cycles, 202 Files, Reports, and the HRDotNet employee directory. It includes standard and 360-degree feedback, draft preservation, sequential stages, release controls, search, filtering, and numbered pagination. One application shell and design system serve all three roles.</w:t>
       </w:r>
     </w:p>
     <w:p>
@@ -1875,7 +1875,7 @@
     </w:p>
     <w:p>
       <w:r>
-        <w:t>One expandable Reviews sidebar parent contains All Reviews and, for HR only, Templates and Cycles. Templates expands into Goals Templates and Behavioral Templates. These are separate pages; there are no horizontal tabs switching between Reviews, Templates, and Cycles. The Reviews listing retains All Reviews, My Reviews, Completed, and the Manager's Team Reviews scope where available.</w:t>
+        <w:t>One expandable Reviews sidebar parent contains All Reviews and, for HR only, Templates and Cycles. Templates expands into KPI Goal Templates and Behavioral Assessment Templates. These are separate pages; there are no horizontal tabs switching between Reviews, Templates, and Cycles. The Reviews listing retains All Reviews, My Reviews, Completed, and the Manager's Team Reviews scope where available.</w:t>
       </w:r>
     </w:p>
     <w:p>
@@ -1893,7 +1893,7 @@
     </w:p>
     <w:p>
       <w:r>
-        <w:t>Both categories provide All Templates, Draft, and Published listing tabs, defaulting to All Templates on initial load. Goals Templates show name/version, applicable position, indicator count, status, and updated date. Behavioral Templates retain description, review type, question count, version, updated date, and status. Search applies within the selected category and tab; Behavioral Review Type filtering remains available.</w:t>
+        <w:t>Both categories provide All Templates, Draft, and Published listing tabs, defaulting to All Templates on initial load. KPI Goal Templates show name/version, applicable position, indicator count, status, and updated date. Behavioral Assessment Templates retain description, review type, question count, version, updated date, and status. Search applies within the selected category and tab; Behavioral Review Type filtering remains available.</w:t>
       </w:r>
     </w:p>
     <w:p>
@@ -1973,7 +1973,7 @@
         <w:pStyle w:val="Heading1"/>
       </w:pPr>
       <w:r>
-        <w:t>5 Goals and Goals Templates Requirements</w:t>
+        <w:t>5 Goals and KPI Goal Templates Requirements</w:t>
       </w:r>
     </w:p>
     <w:p>
@@ -1986,12 +1986,12 @@
     </w:p>
     <w:p>
       <w:r>
-        <w:t>A Goals Template defines reusable position-specific indicators, units, target defaults, achievement direction, indicator weights, and scoring criteria. It is not an employee's live goal and has no employee progress. An assigned employee goal is a real operational record with an owner, deadline, progress, milestones, actual outcomes, and verification history. The Goals module is the workspace for those records.</w:t>
+        <w:t>A KPI Goal Template defines reusable position-specific indicators, units, target defaults, achievement direction, indicator weights, and scoring criteria. It is not an employee's live goal and has no employee progress. An assigned employee goal is a real operational record with an owner, deadline, progress, milestones, actual outcomes, and verification history. The Goals module is the workspace for those records.</w:t>
       </w:r>
     </w:p>
     <w:p>
       <w:r>
-        <w:t>Evaluation Setup in a Review Cycle links each participant to a compatible published Goals Template and maps its required indicators to actual assigned goals. Each link retains the goal ID, indicator ID, employee-specific target, unit, direction, weight, score criteria, and verification requirement. One cycle may contain multiple positions and multiple Goals Templates. Position matching must use the existing employee position; one template must not be applied to every employee merely because they share a cycle.</w:t>
+        <w:t>Evaluation Setup in a Review Cycle links each participant to a compatible published KPI Goal Template and maps its required indicators to actual assigned goals. Each link retains the goal ID, indicator ID, employee-specific target, unit, direction, weight, score criteria, and verification requirement. One cycle may contain multiple positions and multiple KPI Goal Templates. Position matching must use the existing employee position; one template must not be applied to every employee merely because they share a cycle.</w:t>
       </w:r>
     </w:p>
     <w:p>
@@ -2045,7 +2045,7 @@
         <w:pStyle w:val="Heading1"/>
       </w:pPr>
       <w:r>
-        <w:t>6 Behavioral Templates Requirements</w:t>
+        <w:t>6 Behavioral Assessment Templates Requirements</w:t>
       </w:r>
     </w:p>
     <w:p>
@@ -2055,12 +2055,12 @@
     </w:p>
     <w:p>
       <w:r>
-        <w:t>Drafts can be saved without satisfying every publication rule. Publishing validates required template information and question configuration. Only Published, position-compatible Behavioral Templates are eligible for new cycle configuration. Archived records remain discoverable but cannot be newly selected. Editing a published form creates the existing versioned draft workflow; launched assignments retain the question snapshot used at launch.</w:t>
+        <w:t>Drafts can be saved without satisfying every publication rule. Publishing validates required template information and question configuration. Only Published, position-compatible Behavioral Assessment Templates are eligible for new cycle configuration. Archived records remain discoverable but cannot be newly selected. Editing a published form creates the existing versioned draft workflow; launched assignments retain the question snapshot used at launch.</w:t>
       </w:r>
     </w:p>
     <w:p>
       <w:r>
-        <w:t>Evaluation Setup chooses a default Behavioral Template and optional explicit mappings by position. The cycle resolves a compatible published template for every participant. Each assessment stage collects that evaluator's own response against the resolved snapshot. Preview allows HR to inspect the form before use. Goals indicators remain in Goals Templates and are not merged into the Behavioral listing or question builder.</w:t>
+        <w:t>Evaluation Setup chooses a default Behavioral Assessment Template and optional explicit mappings by position. The cycle resolves a compatible published template for every participant. Each assessment stage collects that evaluator's own response against the resolved snapshot. Preview allows HR to inspect the form before use. Goals indicators remain in KPI Goal Templates and are not merged into the Behavioral listing or question builder.</w:t>
       </w:r>
     </w:p>
     <w:p>
@@ -2122,7 +2122,7 @@
     </w:p>
     <w:p>
       <w:r>
-        <w:t>Do not display Goals Templates, assigned-goal counts, goal readiness, or goal configuration actions here. This step depends on the cycle identity and period from Step 1, but unresolved goals do not prevent selecting participants or proceeding to Evaluation Setup. The next step resolves goal readiness for the selected employees.</w:t>
+        <w:t>Do not display KPI Goal Templates, assigned-goal counts, goal readiness, or goal configuration actions here. This step depends on the cycle identity and period from Step 1, but unresolved goals do not prevent selecting participants or proceeding to Evaluation Setup. The next step resolves goal readiness for the selected employees.</w:t>
       </w:r>
     </w:p>
     <w:p>
@@ -2140,7 +2140,7 @@
     </w:p>
     <w:p>
       <w:r>
-        <w:t>Goals Performance uses the description Review the assigned goals that will be included in this evaluation. Its table columns are Employee, Applicable Goals Template, Assigned Goals, and Action. Show employee name and position, the applicable published position-specific template and version, and the number of eligible actual assigned goal records linked from Goals. The count is not the number of template indicators alone. Maria, James, and Sofia each have three linked assigned goals in the sample cycle.</w:t>
+        <w:t>Goals Performance uses the description Review the assigned goals that will be included in this evaluation. Its table columns are Employee, Applicable KPI Goal Template, Assigned Goals, and Action. Show employee name and position, the applicable published position-specific template and version, and the number of eligible actual assigned goal records linked from Goals. The count is not the number of template indicators alone. Maria, James, and Sofia each have three linked assigned goals in the sample cycle.</w:t>
       </w:r>
     </w:p>
     <w:p>
@@ -2155,12 +2155,12 @@
     </w:p>
     <w:p>
       <w:r>
-        <w:t>Behavioral Performance uses the description Select the behavioral template used to assess workplace behaviors. Provide one required Behavioral Template dropdown, selected version, question count, and Preview Template. New setup defaults to a published reusable template; saved explicit selections remain until HR changes them or resolves validation. If no suitable published template exists, show an empty selection and block launch until resolved. An optional collapsed Customize by Position section retains explicit position mappings. Every participant must resolve to a compatible published template through the default or override. Preview closes back to the same setup context without saving preview responses. Do not repeat template selectors for every assessment stage or repeat the full employee table in this section.</w:t>
+        <w:t>Behavioral Performance uses the description Select the Behavioral Assessment Template used to assess workplace behaviors. Provide one required Behavioral Assessment Template dropdown, selected version, question count, and Preview Template. New setup defaults to a published reusable template; saved explicit selections remain until HR changes them or resolves validation. If no suitable published template exists, show an empty selection and block launch until resolved. An optional collapsed Customize by Position section retains explicit position mappings. Every participant must resolve to a compatible published template through the default or override. Preview closes back to the same setup context without saving preview responses. Do not repeat template selectors for every assessment stage or repeat the full employee table in this section.</w:t>
       </w:r>
     </w:p>
     <w:p>
       <w:r>
-        <w:t>Internally, new and migrated draft setups use manager-verified goal criteria and average eligible observed numerical behavioral responses. Both dimension ratings use the five-point scale. Overall Performance Rating = (Goals Performance Rating + Behavioral Performance Rating) / 2. This proposed fixed equal-contribution default is pending HR confirmation and is not a permanent approved company scoring policy. Preserve the criteria and five-point conversion of Goals Templates; simplifying the wizard does not replace verified goal evidence with progress percentages.</w:t>
+        <w:t>Internally, new and migrated draft setups use manager-verified goal criteria and average eligible observed numerical behavioral responses. Both dimension ratings use the five-point scale. Overall Performance Rating = (Goals Performance Rating + Behavioral Performance Rating) / 2. This proposed fixed equal-contribution default is pending HR confirmation and is not a permanent approved company scoring policy. Preserve the criteria and five-point conversion of KPI Goal Templates; simplifying the wizard does not replace verified goal evidence with progress percentages.</w:t>
       </w:r>
     </w:p>
     <w:p>
@@ -2201,7 +2201,7 @@
     </w:p>
     <w:p>
       <w:r>
-        <w:t>Purpose: confirm a concise summary before creating evaluator work. Show cycle name/type and evaluation period, assessment start, selected participants and assigned-goal readiness, default Behavioral Template/version/count and any explicit position overrides, assessment sequence, employee-to-evaluator mappings, individual deadlines, and manual HR result-release configuration. This step introduces no additional configuration fields or weighting choices.</w:t>
+        <w:t>Purpose: confirm a concise summary before creating evaluator work. Show cycle name/type and evaluation period, assessment start, selected participants and assigned-goal readiness, default Behavioral Assessment Template/version/count and any explicit position overrides, assessment sequence, employee-to-evaluator mappings, individual deadlines, and manual HR result-release configuration. This step introduces no additional configuration fields or weighting choices.</w:t>
       </w:r>
     </w:p>
     <w:p>
@@ -3750,7 +3750,7 @@
     </w:p>
     <w:p>
       <w:r>
-        <w:t>The preserved Annual Performance Review 2026 example includes Maria Cruz, James Santos, and Sofia Garcia in one cycle, using their respective published position-specific Goals Templates. Each employee has three linked assigned goals. Reuse actual goal IDs where appropriate rather than duplicating them at launch. Separate completed and historical cycles retain their original evaluation periods and frozen result evidence.</w:t>
+        <w:t>The preserved Annual Performance Review 2026 example includes Maria Cruz, James Santos, and Sofia Garcia in one cycle, using their respective published position-specific KPI Goal Templates. Each employee has three linked assigned goals. Reuse actual goal IDs where appropriate rather than duplicating them at launch. Separate completed and historical cycles retain their original evaluation periods and frozen result evidence.</w:t>
       </w:r>
     </w:p>
     <w:tbl>
@@ -4223,7 +4223,7 @@
         <w:t xml:space="preserve">FR-CYCLE-002 </w:t>
       </w:r>
       <w:r>
-        <w:t>— Support mixed-position participants with compatible published Goals Templates. Maria, James, and Sofia can share one cycle with three different template mappings. Missing goals, incompatible position, duplicate mapping, and unauthorized employees block valid launch and link to Step 3 for goal corrections.</w:t>
+        <w:t>— Support mixed-position participants with compatible published KPI Goal Templates. Maria, James, and Sofia can share one cycle with three different template mappings. Missing goals, incompatible position, duplicate mapping, and unauthorized employees block valid launch and link to Step 3 for goal corrections.</w:t>
       </w:r>
     </w:p>
     <w:p>
@@ -4421,6 +4421,7 @@
     <w:p>
       <w:pPr>
         <w:pStyle w:val="Heading1"/>
+        <w:spacing w:after="40"/>
       </w:pPr>
       <w:r>
         <w:t>15 Assumptions Dependencies and Open Decisions</w:t>
@@ -4429,6 +4430,7 @@
     <w:p>
       <w:pPr>
         <w:pStyle w:val="Heading2"/>
+        <w:spacing w:after="40"/>
       </w:pPr>
       <w:r>
         <w:t>HR decisions required</w:t>
@@ -5063,34 +5065,49 @@
     </w:tbl>
     <w:p>
       <w:pPr>
-        <w:spacing w:after="20"/>
+        <w:spacing w:after="40"/>
       </w:pPr>
     </w:p>
     <w:p>
       <w:pPr>
         <w:pStyle w:val="Heading2"/>
+        <w:spacing w:after="40"/>
       </w:pPr>
       <w:r>
         <w:t>Dependencies and implementation boundaries</w:t>
       </w:r>
     </w:p>
     <w:p>
+      <w:pPr>
+        <w:spacing w:after="40"/>
+      </w:pPr>
       <w:r>
         <w:t>HRDotNet must provide stable employee identifiers, active-company access, positions, departments, and official reporting relationships. Performance-manager overrides need an agreed synchronization and conflict policy. Production identity, server persistence, transaction safety, notifications, file retention, and audit services must be selected and integrated. Drafts, submissions, verification signatures, and finalized snapshots require durable storage and concurrency protection.</w:t>
       </w:r>
     </w:p>
     <w:p>
+      <w:pPr>
+        <w:spacing w:after="40"/>
+      </w:pPr>
       <w:r>
         <w:t>Results and exports must preserve confidentiality and tenant scope. Production accessibility must cover keyboard operation, focus restoration, associated errors, dialog focus behavior, and readable contrast. Larger data volumes require server filtering/pagination with totals equivalent to the current local interaction model. Backup, restoration, retention, service availability, and measurable response-time targets require deployment decisions.</w:t>
       </w:r>
     </w:p>
     <w:p>
+      <w:pPr>
+        <w:spacing w:after="40"/>
+      </w:pPr>
       <w:r>
         <w:t>The supplied logo artwork is the branding reference. Existing local sample dates, names, ratings, observations, and example scoring values support demonstrations only. Earlier requirements for a separate Results &amp; Release creation step, optional evaluation components and user-configured cycle weighting/scoring selectors are superseded for new setup. Earlier requirements for manager-created cycles, horizontal Reviews/Templates/Cycles page tabs, organization charts for Employees, standalone listing KPI cards, and automatically finalized submissions are superseded by the role, navigation, dashboard, and sequential workflow rules in this specification.</w:t>
       </w:r>
     </w:p>
     <w:sectPr>
       <w:footerReference w:type="default" r:id="rId10"/>
+      <w:headerReference w:type="default" r:id="rId11"/>
+      <w:headerReference w:type="first" r:id="rId12"/>
+      <w:footerReference w:type="first" r:id="rId13"/>
+      <w:headerReference w:type="even" r:id="rId14"/>
+      <w:footerReference w:type="even" r:id="rId15"/>
       <w:pgSz w:w="11909" w:h="16834"/>
       <w:pgMar w:top="1008" w:right="1080" w:bottom="1008" w:left="1080" w:header="720" w:footer="432" w:gutter="0"/>
       <w:cols w:space="720"/>
@@ -5117,6 +5134,56 @@
     <w:fldSimple w:instr="PAGE"/>
   </w:p>
 </w:ftr>
+</file>
+
+<file path=word/footer2.xml><?xml version="1.0" encoding="utf-8"?>
+<w:ftr xmlns:m="http://schemas.openxmlformats.org/officeDocument/2006/math" xmlns:mc="http://schemas.openxmlformats.org/markup-compatibility/2006" xmlns:mo="http://schemas.microsoft.com/office/mac/office/2008/main" xmlns:mv="urn:schemas-microsoft-com:mac:vml" xmlns:o="urn:schemas-microsoft-com:office:office" xmlns:r="http://schemas.openxmlformats.org/officeDocument/2006/relationships" xmlns:v="urn:schemas-microsoft-com:vml" xmlns:w10="urn:schemas-microsoft-com:office:word" xmlns:w14="http://schemas.microsoft.com/office/word/2010/wordml" xmlns:w="http://schemas.openxmlformats.org/wordprocessingml/2006/main" xmlns:wne="http://schemas.microsoft.com/office/word/2006/wordml" xmlns:wp14="http://schemas.microsoft.com/office/word/2010/wordprocessingDrawing" xmlns:wp="http://schemas.openxmlformats.org/drawingml/2006/wordprocessingDrawing" xmlns:wpc="http://schemas.microsoft.com/office/word/2010/wordprocessingCanvas" xmlns:wpg="http://schemas.microsoft.com/office/word/2010/wordprocessingGroup" xmlns:wpi="http://schemas.microsoft.com/office/word/2010/wordprocessingInk" xmlns:wps="http://schemas.microsoft.com/office/word/2010/wordprocessingShape" mc:Ignorable="w14 wp14">
+  <w:p>
+    <w:pPr>
+      <w:pStyle w:val="Footer"/>
+    </w:pPr>
+  </w:p>
+</w:ftr>
+</file>
+
+<file path=word/footer3.xml><?xml version="1.0" encoding="utf-8"?>
+<w:ftr xmlns:m="http://schemas.openxmlformats.org/officeDocument/2006/math" xmlns:mc="http://schemas.openxmlformats.org/markup-compatibility/2006" xmlns:mo="http://schemas.microsoft.com/office/mac/office/2008/main" xmlns:mv="urn:schemas-microsoft-com:mac:vml" xmlns:o="urn:schemas-microsoft-com:office:office" xmlns:r="http://schemas.openxmlformats.org/officeDocument/2006/relationships" xmlns:v="urn:schemas-microsoft-com:vml" xmlns:w10="urn:schemas-microsoft-com:office:word" xmlns:w14="http://schemas.microsoft.com/office/word/2010/wordml" xmlns:w="http://schemas.openxmlformats.org/wordprocessingml/2006/main" xmlns:wne="http://schemas.microsoft.com/office/word/2006/wordml" xmlns:wp14="http://schemas.microsoft.com/office/word/2010/wordprocessingDrawing" xmlns:wp="http://schemas.openxmlformats.org/drawingml/2006/wordprocessingDrawing" xmlns:wpc="http://schemas.microsoft.com/office/word/2010/wordprocessingCanvas" xmlns:wpg="http://schemas.microsoft.com/office/word/2010/wordprocessingGroup" xmlns:wpi="http://schemas.microsoft.com/office/word/2010/wordprocessingInk" xmlns:wps="http://schemas.microsoft.com/office/word/2010/wordprocessingShape" mc:Ignorable="w14 wp14">
+  <w:p>
+    <w:pPr>
+      <w:pStyle w:val="Footer"/>
+    </w:pPr>
+  </w:p>
+</w:ftr>
+</file>
+
+<file path=word/header1.xml><?xml version="1.0" encoding="utf-8"?>
+<w:hdr xmlns:m="http://schemas.openxmlformats.org/officeDocument/2006/math" xmlns:mc="http://schemas.openxmlformats.org/markup-compatibility/2006" xmlns:mo="http://schemas.microsoft.com/office/mac/office/2008/main" xmlns:mv="urn:schemas-microsoft-com:mac:vml" xmlns:o="urn:schemas-microsoft-com:office:office" xmlns:r="http://schemas.openxmlformats.org/officeDocument/2006/relationships" xmlns:v="urn:schemas-microsoft-com:vml" xmlns:w10="urn:schemas-microsoft-com:office:word" xmlns:w14="http://schemas.microsoft.com/office/word/2010/wordml" xmlns:w="http://schemas.openxmlformats.org/wordprocessingml/2006/main" xmlns:wne="http://schemas.microsoft.com/office/word/2006/wordml" xmlns:wp14="http://schemas.microsoft.com/office/word/2010/wordprocessingDrawing" xmlns:wp="http://schemas.openxmlformats.org/drawingml/2006/wordprocessingDrawing" xmlns:wpc="http://schemas.microsoft.com/office/word/2010/wordprocessingCanvas" xmlns:wpg="http://schemas.microsoft.com/office/word/2010/wordprocessingGroup" xmlns:wpi="http://schemas.microsoft.com/office/word/2010/wordprocessingInk" xmlns:wps="http://schemas.microsoft.com/office/word/2010/wordprocessingShape" mc:Ignorable="w14 wp14">
+  <w:p>
+    <w:pPr>
+      <w:pStyle w:val="Header"/>
+    </w:pPr>
+  </w:p>
+</w:hdr>
+</file>
+
+<file path=word/header2.xml><?xml version="1.0" encoding="utf-8"?>
+<w:hdr xmlns:m="http://schemas.openxmlformats.org/officeDocument/2006/math" xmlns:mc="http://schemas.openxmlformats.org/markup-compatibility/2006" xmlns:mo="http://schemas.microsoft.com/office/mac/office/2008/main" xmlns:mv="urn:schemas-microsoft-com:mac:vml" xmlns:o="urn:schemas-microsoft-com:office:office" xmlns:r="http://schemas.openxmlformats.org/officeDocument/2006/relationships" xmlns:v="urn:schemas-microsoft-com:vml" xmlns:w10="urn:schemas-microsoft-com:office:word" xmlns:w14="http://schemas.microsoft.com/office/word/2010/wordml" xmlns:w="http://schemas.openxmlformats.org/wordprocessingml/2006/main" xmlns:wne="http://schemas.microsoft.com/office/word/2006/wordml" xmlns:wp14="http://schemas.microsoft.com/office/word/2010/wordprocessingDrawing" xmlns:wp="http://schemas.openxmlformats.org/drawingml/2006/wordprocessingDrawing" xmlns:wpc="http://schemas.microsoft.com/office/word/2010/wordprocessingCanvas" xmlns:wpg="http://schemas.microsoft.com/office/word/2010/wordprocessingGroup" xmlns:wpi="http://schemas.microsoft.com/office/word/2010/wordprocessingInk" xmlns:wps="http://schemas.microsoft.com/office/word/2010/wordprocessingShape" mc:Ignorable="w14 wp14">
+  <w:p>
+    <w:pPr>
+      <w:pStyle w:val="Header"/>
+    </w:pPr>
+  </w:p>
+</w:hdr>
+</file>
+
+<file path=word/header3.xml><?xml version="1.0" encoding="utf-8"?>
+<w:hdr xmlns:m="http://schemas.openxmlformats.org/officeDocument/2006/math" xmlns:mc="http://schemas.openxmlformats.org/markup-compatibility/2006" xmlns:mo="http://schemas.microsoft.com/office/mac/office/2008/main" xmlns:mv="urn:schemas-microsoft-com:mac:vml" xmlns:o="urn:schemas-microsoft-com:office:office" xmlns:r="http://schemas.openxmlformats.org/officeDocument/2006/relationships" xmlns:v="urn:schemas-microsoft-com:vml" xmlns:w10="urn:schemas-microsoft-com:office:word" xmlns:w14="http://schemas.microsoft.com/office/word/2010/wordml" xmlns:w="http://schemas.openxmlformats.org/wordprocessingml/2006/main" xmlns:wne="http://schemas.microsoft.com/office/word/2006/wordml" xmlns:wp14="http://schemas.microsoft.com/office/word/2010/wordprocessingDrawing" xmlns:wp="http://schemas.openxmlformats.org/drawingml/2006/wordprocessingDrawing" xmlns:wpc="http://schemas.microsoft.com/office/word/2010/wordprocessingCanvas" xmlns:wpg="http://schemas.microsoft.com/office/word/2010/wordprocessingGroup" xmlns:wpi="http://schemas.microsoft.com/office/word/2010/wordprocessingInk" xmlns:wps="http://schemas.microsoft.com/office/word/2010/wordprocessingShape" mc:Ignorable="w14 wp14">
+  <w:p>
+    <w:pPr>
+      <w:pStyle w:val="Header"/>
+    </w:pPr>
+  </w:p>
+</w:hdr>
 </file>
 
 <file path=word/numbering.xml><?xml version="1.0" encoding="utf-8"?>

</xml_diff>